<commit_message>
FAST application packet: link to handbook, add checklist
Requirements now link to the undergraduate handbook (eligibility,
application process, roadmap) and to the M.A. section of the How to
Apply page for evidence of abilities, in place of restated text.

- New checklist section with Word checkboxes: eligibility (including
  60 to 90 program-applicable units) and materials and submission.
- Application form reduced to identification, emphasis, entry path,
  start semester, F-1 status, recommenders, and evidence links.
- Materials match the M.A.: CV or résumé, 2 letters, 2-page statement
  of purpose, evidence of abilities.
</commit_message>
<xml_diff>
--- a/documents/forms/fast-application.docx
+++ b/documents/forms/fast-application.docx
@@ -284,12 +284,12 @@
           <w:sz w:val="26"/>
           <w:szCs w:val="26"/>
         </w:rPr>
-        <w:t xml:space="preserve">The program</w:t>
-      </w:r>
-    </w:p>
-    <w:p>
-      <w:pPr>
-        <w:spacing w:after="160" w:line="330"/>
+        <w:t xml:space="preserve">Requirements</w:t>
+      </w:r>
+    </w:p>
+    <w:p>
+      <w:pPr>
+        <w:spacing w:after="100" w:line="330"/>
       </w:pPr>
       <w:r>
         <w:rPr>
@@ -298,22 +298,17 @@
           <w:sz w:val="22"/>
           <w:szCs w:val="22"/>
         </w:rPr>
-        <w:t xml:space="preserve">The FAST (Falcon Accelerated Success Track) B.A./M.A. in Music leads to both the B.A. and the M.A. in Music. Students who start in the first year finish both degrees in five years, and transfer students who enter at junior standing finish in three. Up to 11 units count toward both degrees.</w:t>
-      </w:r>
-    </w:p>
-    <w:p>
-      <w:pPr>
-        <w:spacing w:after="160" w:line="330"/>
-      </w:pPr>
-      <w:r>
-        <w:rPr>
-          <w:rFonts w:ascii="Roboto Serif" w:cs="Roboto Serif" w:eastAsia="Roboto Serif" w:hAnsi="Roboto Serif"/>
-          <w:color w:val="000000"/>
-          <w:sz w:val="22"/>
-          <w:szCs w:val="22"/>
-        </w:rPr>
-        <w:t xml:space="preserve">The </w:t>
-      </w:r>
+        <w:t xml:space="preserve">FAST eligibility, the application materials, and the deadlines are set out in the undergraduate handbook. The evidence of abilities for each area of emphasis is set out on the How to Apply page.</w:t>
+      </w:r>
+    </w:p>
+    <w:p>
+      <w:pPr>
+        <w:numPr>
+          <w:ilvl w:val="0"/>
+          <w:numId w:val="1"/>
+        </w:numPr>
+        <w:spacing w:after="100" w:line="320"/>
+      </w:pPr>
       <w:hyperlink r:id="rId100" w:history="1">
         <w:r>
           <w:rPr>
@@ -323,18 +318,18 @@
             <w:szCs w:val="22"/>
             <w:u w:val="single" w:color="D50032"/>
           </w:rPr>
-          <w:t xml:space="preserve">FAST 4+1 roadmap</w:t>
+          <w:t xml:space="preserve">Eligibility and admission</w:t>
         </w:r>
       </w:hyperlink>
-      <w:r>
-        <w:rPr>
-          <w:rFonts w:ascii="Roboto Serif" w:cs="Roboto Serif" w:eastAsia="Roboto Serif" w:hAnsi="Roboto Serif"/>
-          <w:color w:val="000000"/>
-          <w:sz w:val="22"/>
-          <w:szCs w:val="22"/>
-        </w:rPr>
-        <w:t xml:space="preserve"> and the </w:t>
-      </w:r>
+    </w:p>
+    <w:p>
+      <w:pPr>
+        <w:numPr>
+          <w:ilvl w:val="0"/>
+          <w:numId w:val="1"/>
+        </w:numPr>
+        <w:spacing w:after="100" w:line="320"/>
+      </w:pPr>
       <w:hyperlink r:id="rId101" w:history="1">
         <w:r>
           <w:rPr>
@@ -344,18 +339,18 @@
             <w:szCs w:val="22"/>
             <w:u w:val="single" w:color="D50032"/>
           </w:rPr>
-          <w:t xml:space="preserve">FAST 2+1 transfer roadmap</w:t>
+          <w:t xml:space="preserve">Application process</w:t>
         </w:r>
       </w:hyperlink>
-      <w:r>
-        <w:rPr>
-          <w:rFonts w:ascii="Roboto Serif" w:cs="Roboto Serif" w:eastAsia="Roboto Serif" w:hAnsi="Roboto Serif"/>
-          <w:color w:val="000000"/>
-          <w:sz w:val="22"/>
-          <w:szCs w:val="22"/>
-        </w:rPr>
-        <w:t xml:space="preserve"> lay out the courses semester by semester. The double-counted courses are listed in the </w:t>
-      </w:r>
+    </w:p>
+    <w:p>
+      <w:pPr>
+        <w:numPr>
+          <w:ilvl w:val="0"/>
+          <w:numId w:val="1"/>
+        </w:numPr>
+        <w:spacing w:after="100" w:line="320"/>
+      </w:pPr>
       <w:hyperlink r:id="rId102" w:history="1">
         <w:r>
           <w:rPr>
@@ -365,60 +360,9 @@
             <w:szCs w:val="22"/>
             <w:u w:val="single" w:color="D50032"/>
           </w:rPr>
-          <w:t xml:space="preserve">undergraduate handbook</w:t>
+          <w:t xml:space="preserve">Evidence of abilities (How to Apply, M.A. in Music)</w:t>
         </w:r>
       </w:hyperlink>
-      <w:r>
-        <w:rPr>
-          <w:rFonts w:ascii="Roboto Serif" w:cs="Roboto Serif" w:eastAsia="Roboto Serif" w:hAnsi="Roboto Serif"/>
-          <w:color w:val="000000"/>
-          <w:sz w:val="22"/>
-          <w:szCs w:val="22"/>
-        </w:rPr>
-        <w:t xml:space="preserve">.</w:t>
-      </w:r>
-    </w:p>
-    <w:p>
-      <w:pPr>
-        <w:keepNext/>
-        <w:spacing w:after="130" w:before="260"/>
-      </w:pPr>
-      <w:r>
-        <w:rPr>
-          <w:rFonts w:ascii="Montserrat" w:cs="Montserrat" w:eastAsia="Montserrat" w:hAnsi="Montserrat"/>
-          <w:b/>
-          <w:bCs/>
-          <w:color w:val="D50032"/>
-          <w:sz w:val="26"/>
-          <w:szCs w:val="26"/>
-        </w:rPr>
-        <w:t xml:space="preserve">02  </w:t>
-      </w:r>
-      <w:r>
-        <w:rPr>
-          <w:rFonts w:ascii="Montserrat" w:cs="Montserrat" w:eastAsia="Montserrat" w:hAnsi="Montserrat"/>
-          <w:b/>
-          <w:bCs/>
-          <w:color w:val="000000"/>
-          <w:sz w:val="26"/>
-          <w:szCs w:val="26"/>
-        </w:rPr>
-        <w:t xml:space="preserve">Eligibility</w:t>
-      </w:r>
-    </w:p>
-    <w:p>
-      <w:pPr>
-        <w:spacing w:after="100" w:line="330"/>
-      </w:pPr>
-      <w:r>
-        <w:rPr>
-          <w:rFonts w:ascii="Roboto Serif" w:cs="Roboto Serif" w:eastAsia="Roboto Serif" w:hAnsi="Roboto Serif"/>
-          <w:color w:val="000000"/>
-          <w:sz w:val="22"/>
-          <w:szCs w:val="22"/>
-        </w:rPr>
-        <w:t xml:space="preserve">At the time of admission, you need all of the following:</w:t>
-      </w:r>
     </w:p>
     <w:p>
       <w:pPr>
@@ -428,120 +372,6 @@
         </w:numPr>
         <w:spacing w:after="100" w:line="320"/>
       </w:pPr>
-      <w:r>
-        <w:rPr>
-          <w:rFonts w:ascii="Roboto Serif" w:cs="Roboto Serif" w:eastAsia="Roboto Serif" w:hAnsi="Roboto Serif"/>
-          <w:color w:val="000000"/>
-          <w:sz w:val="22"/>
-          <w:szCs w:val="22"/>
-        </w:rPr>
-        <w:t xml:space="preserve">Current enrollment in the B.A. in Music at CSU East Bay.</w:t>
-      </w:r>
-    </w:p>
-    <w:p>
-      <w:pPr>
-        <w:numPr>
-          <w:ilvl w:val="0"/>
-          <w:numId w:val="1"/>
-        </w:numPr>
-        <w:spacing w:after="100" w:line="320"/>
-      </w:pPr>
-      <w:r>
-        <w:rPr>
-          <w:rFonts w:ascii="Roboto Serif" w:cs="Roboto Serif" w:eastAsia="Roboto Serif" w:hAnsi="Roboto Serif"/>
-          <w:color w:val="000000"/>
-          <w:sz w:val="22"/>
-          <w:szCs w:val="22"/>
-        </w:rPr>
-        <w:t xml:space="preserve">Between 60 and 90 units completed.</w:t>
-      </w:r>
-    </w:p>
-    <w:p>
-      <w:pPr>
-        <w:numPr>
-          <w:ilvl w:val="0"/>
-          <w:numId w:val="1"/>
-        </w:numPr>
-        <w:spacing w:after="100" w:line="320"/>
-      </w:pPr>
-      <w:r>
-        <w:rPr>
-          <w:rFonts w:ascii="Roboto Serif" w:cs="Roboto Serif" w:eastAsia="Roboto Serif" w:hAnsi="Roboto Serif"/>
-          <w:color w:val="000000"/>
-          <w:sz w:val="22"/>
-          <w:szCs w:val="22"/>
-        </w:rPr>
-        <w:t xml:space="preserve">All lower-division general education and the 15 units of lower-division core music courses completed.</w:t>
-      </w:r>
-    </w:p>
-    <w:p>
-      <w:pPr>
-        <w:numPr>
-          <w:ilvl w:val="0"/>
-          <w:numId w:val="1"/>
-        </w:numPr>
-        <w:spacing w:after="100" w:line="320"/>
-      </w:pPr>
-      <w:r>
-        <w:rPr>
-          <w:rFonts w:ascii="Roboto Serif" w:cs="Roboto Serif" w:eastAsia="Roboto Serif" w:hAnsi="Roboto Serif"/>
-          <w:color w:val="000000"/>
-          <w:sz w:val="22"/>
-          <w:szCs w:val="22"/>
-        </w:rPr>
-        <w:t xml:space="preserve">A cumulative GPA of at least 2.5.</w:t>
-      </w:r>
-    </w:p>
-    <w:p>
-      <w:pPr>
-        <w:numPr>
-          <w:ilvl w:val="0"/>
-          <w:numId w:val="1"/>
-        </w:numPr>
-        <w:spacing w:after="100" w:line="320"/>
-      </w:pPr>
-      <w:r>
-        <w:rPr>
-          <w:rFonts w:ascii="Roboto Serif" w:cs="Roboto Serif" w:eastAsia="Roboto Serif" w:hAnsi="Roboto Serif"/>
-          <w:color w:val="000000"/>
-          <w:sz w:val="22"/>
-          <w:szCs w:val="22"/>
-        </w:rPr>
-        <w:t xml:space="preserve">A GPA of at least 3.0 in your music courses.</w:t>
-      </w:r>
-    </w:p>
-    <w:p>
-      <w:pPr>
-        <w:spacing w:after="60" w:line="330"/>
-      </w:pPr>
-    </w:p>
-    <w:p>
-      <w:pPr>
-        <w:spacing w:after="160" w:line="330"/>
-      </w:pPr>
-      <w:r>
-        <w:rPr>
-          <w:rFonts w:ascii="Roboto Serif" w:cs="Roboto Serif" w:eastAsia="Roboto Serif" w:hAnsi="Roboto Serif"/>
-          <w:color w:val="000000"/>
-          <w:sz w:val="22"/>
-          <w:szCs w:val="22"/>
-        </w:rPr>
-        <w:t xml:space="preserve">The program doesn’t offer conditional admission or exceptions to these requirements.</w:t>
-      </w:r>
-    </w:p>
-    <w:p>
-      <w:pPr>
-        <w:spacing w:after="160" w:line="330"/>
-      </w:pPr>
-      <w:r>
-        <w:rPr>
-          <w:rFonts w:ascii="Roboto Serif" w:cs="Roboto Serif" w:eastAsia="Roboto Serif" w:hAnsi="Roboto Serif"/>
-          <w:color w:val="000000"/>
-          <w:sz w:val="22"/>
-          <w:szCs w:val="22"/>
-        </w:rPr>
-        <w:t xml:space="preserve">If you’re an international student on an F-1 visa, contact the </w:t>
-      </w:r>
       <w:hyperlink r:id="rId103" w:history="1">
         <w:r>
           <w:rPr>
@@ -551,18 +381,9 @@
             <w:szCs w:val="22"/>
             <w:u w:val="single" w:color="D50032"/>
           </w:rPr>
-          <w:t xml:space="preserve">Center for International Education</w:t>
+          <w:t xml:space="preserve">Degree roadmap and double-counted courses</w:t>
         </w:r>
       </w:hyperlink>
-      <w:r>
-        <w:rPr>
-          <w:rFonts w:ascii="Roboto Serif" w:cs="Roboto Serif" w:eastAsia="Roboto Serif" w:hAnsi="Roboto Serif"/>
-          <w:color w:val="000000"/>
-          <w:sz w:val="22"/>
-          <w:szCs w:val="22"/>
-        </w:rPr>
-        <w:t xml:space="preserve"> before you apply. Moving to graduate status in FAST requires a new I-20.</w:t>
-      </w:r>
     </w:p>
     <w:p>
       <w:pPr>
@@ -578,7 +399,7 @@
           <w:sz w:val="26"/>
           <w:szCs w:val="26"/>
         </w:rPr>
-        <w:t xml:space="preserve">03  </w:t>
+        <w:t xml:space="preserve">02  </w:t>
       </w:r>
       <w:r>
         <w:rPr>
@@ -589,14 +410,57 @@
           <w:sz w:val="26"/>
           <w:szCs w:val="26"/>
         </w:rPr>
-        <w:t xml:space="preserve">Deadlines</w:t>
+        <w:t xml:space="preserve">Checklist</w:t>
       </w:r>
     </w:p>
     <w:p>
       <w:pPr>
         <w:keepNext/>
-        <w:spacing w:after="160" w:line="330"/>
-      </w:pPr>
+        <w:spacing w:before="180" w:after="80"/>
+      </w:pPr>
+      <w:r>
+        <w:rPr>
+          <w:rFonts w:ascii="Montserrat" w:cs="Montserrat" w:eastAsia="Montserrat" w:hAnsi="Montserrat"/>
+          <w:color w:val="55575B"/>
+          <w:sz w:val="18"/>
+          <w:szCs w:val="18"/>
+        </w:rPr>
+        <w:t xml:space="preserve">Eligibility</w:t>
+      </w:r>
+    </w:p>
+    <w:p>
+      <w:pPr>
+        <w:tabs>
+          <w:tab w:val="left" w:pos="400"/>
+        </w:tabs>
+        <w:spacing w:after="90" w:line="320"/>
+        <w:ind w:left="400" w:hanging="400"/>
+      </w:pPr>
+      <w:sdt>
+        <w:sdtPr>
+          <w:rPr>
+            <w:rFonts w:ascii="MS Gothic" w:eastAsia="MS Gothic" w:hAnsi="MS Gothic"/>
+            <w:sz w:val="22"/>
+          </w:rPr>
+          <w14:checkbox>
+            <w14:checked w14:val="0"/>
+            <w14:checkedState w14:val="2612" w14:font="MS Gothic"/>
+            <w14:uncheckedState w14:val="2610" w14:font="MS Gothic"/>
+          </w14:checkbox>
+        </w:sdtPr>
+        <w:sdtContent>
+          <w:r>
+            <w:rPr>
+              <w:rFonts w:ascii="MS Gothic" w:eastAsia="MS Gothic" w:hAnsi="MS Gothic"/>
+              <w:sz w:val="22"/>
+            </w:rPr>
+            <w:t>☐</w:t>
+          </w:r>
+        </w:sdtContent>
+      </w:sdt>
+      <w:r>
+        <w:tab/>
+      </w:r>
       <w:r>
         <w:rPr>
           <w:rFonts w:ascii="Roboto Serif" w:cs="Roboto Serif" w:eastAsia="Roboto Serif" w:hAnsi="Roboto Serif"/>
@@ -604,337 +468,42 @@
           <w:sz w:val="22"/>
           <w:szCs w:val="22"/>
         </w:rPr>
-        <w:t xml:space="preserve">Applications are accepted in the Fall and Spring semesters only. Letters of recommendation are due by the same deadline as the application.</w:t>
-      </w:r>
-    </w:p>
-    <w:tbl>
-      <w:tblPr>
-        <w:tblW w:type="dxa" w:w="9360"/>
-        <w:tblBorders>
-          <w:top w:val="none" w:color="FFFFFF" w:sz="0"/>
-          <w:left w:val="none" w:color="FFFFFF" w:sz="0"/>
-          <w:bottom w:val="none" w:color="FFFFFF" w:sz="0"/>
-          <w:right w:val="none" w:color="FFFFFF" w:sz="0"/>
-          <w:insideH w:val="none" w:color="FFFFFF" w:sz="0"/>
-          <w:insideV w:val="none" w:color="FFFFFF" w:sz="0"/>
-        </w:tblBorders>
-        <w:tblLayout w:type="fixed"/>
-      </w:tblPr>
-      <w:tblGrid>
-        <w:gridCol w:w="3120"/>
-        <w:gridCol w:w="3120"/>
-        <w:gridCol w:w="3120"/>
-      </w:tblGrid>
-      <w:tr>
-        <w:trPr>
-          <w:cantSplit/>
-        </w:trPr>
-        <w:tc>
-          <w:tcPr>
-            <w:tcW w:type="dxa" w:w="3120"/>
-            <w:tcBorders>
-              <w:top w:val="none" w:color="FFFFFF" w:sz="0"/>
-              <w:left w:val="none" w:color="FFFFFF" w:sz="0"/>
-              <w:bottom w:val="single" w:color="D50032" w:sz="12"/>
-              <w:right w:val="none" w:color="FFFFFF" w:sz="0"/>
-            </w:tcBorders>
-            <w:tcMar>
-              <w:top w:type="dxa" w:w="40"/>
-              <w:left w:type="dxa" w:w="0"/>
-              <w:bottom w:type="dxa" w:w="100"/>
-              <w:right w:type="dxa" w:w="120"/>
-            </w:tcMar>
-          </w:tcPr>
-          <w:p>
-            <w:pPr>
-              <w:keepNext/>
-              <w:jc w:val="left"/>
-            </w:pPr>
-            <w:r>
-              <w:rPr>
-                <w:rFonts w:ascii="Montserrat" w:cs="Montserrat" w:eastAsia="Montserrat" w:hAnsi="Montserrat"/>
-                <w:color w:val="55575B"/>
-                <w:sz w:val="18"/>
-                <w:szCs w:val="18"/>
-              </w:rPr>
-              <w:t xml:space="preserve">Start FAST in</w:t>
-            </w:r>
-          </w:p>
-        </w:tc>
-        <w:tc>
-          <w:tcPr>
-            <w:tcW w:type="dxa" w:w="3120"/>
-            <w:tcBorders>
-              <w:top w:val="none" w:color="FFFFFF" w:sz="0"/>
-              <w:left w:val="none" w:color="FFFFFF" w:sz="0"/>
-              <w:bottom w:val="single" w:color="D50032" w:sz="12"/>
-              <w:right w:val="none" w:color="FFFFFF" w:sz="0"/>
-            </w:tcBorders>
-            <w:tcMar>
-              <w:top w:type="dxa" w:w="40"/>
-              <w:left w:type="dxa" w:w="0"/>
-              <w:bottom w:type="dxa" w:w="100"/>
-              <w:right w:type="dxa" w:w="120"/>
-            </w:tcMar>
-          </w:tcPr>
-          <w:p>
-            <w:pPr>
-              <w:keepNext/>
-              <w:jc w:val="left"/>
-            </w:pPr>
-            <w:r>
-              <w:rPr>
-                <w:rFonts w:ascii="Montserrat" w:cs="Montserrat" w:eastAsia="Montserrat" w:hAnsi="Montserrat"/>
-                <w:color w:val="55575B"/>
-                <w:sz w:val="18"/>
-                <w:szCs w:val="18"/>
-              </w:rPr>
-              <w:t xml:space="preserve">Email your application by</w:t>
-            </w:r>
-          </w:p>
-        </w:tc>
-        <w:tc>
-          <w:tcPr>
-            <w:tcW w:type="dxa" w:w="3120"/>
-            <w:tcBorders>
-              <w:top w:val="none" w:color="FFFFFF" w:sz="0"/>
-              <w:left w:val="none" w:color="FFFFFF" w:sz="0"/>
-              <w:bottom w:val="single" w:color="D50032" w:sz="12"/>
-              <w:right w:val="none" w:color="FFFFFF" w:sz="0"/>
-            </w:tcBorders>
-            <w:tcMar>
-              <w:top w:type="dxa" w:w="40"/>
-              <w:left w:type="dxa" w:w="0"/>
-              <w:bottom w:type="dxa" w:w="100"/>
-              <w:right w:type="dxa" w:w="120"/>
-            </w:tcMar>
-          </w:tcPr>
-          <w:p>
-            <w:pPr>
-              <w:keepNext/>
-              <w:jc w:val="right"/>
-            </w:pPr>
-            <w:r>
-              <w:rPr>
-                <w:rFonts w:ascii="Montserrat" w:cs="Montserrat" w:eastAsia="Montserrat" w:hAnsi="Montserrat"/>
-                <w:color w:val="55575B"/>
-                <w:sz w:val="18"/>
-                <w:szCs w:val="18"/>
-              </w:rPr>
-              <w:t xml:space="preserve">Decision by</w:t>
-            </w:r>
-          </w:p>
-        </w:tc>
-      </w:tr>
-      <w:tr>
-        <w:trPr>
-          <w:cantSplit/>
-        </w:trPr>
-        <w:tc>
-          <w:tcPr>
-            <w:tcW w:type="dxa" w:w="3120"/>
-            <w:tcBorders>
-              <w:top w:val="none" w:color="FFFFFF" w:sz="0"/>
-              <w:left w:val="none" w:color="FFFFFF" w:sz="0"/>
-              <w:bottom w:val="single" w:color="E4E4E6" w:sz="4"/>
-              <w:right w:val="none" w:color="FFFFFF" w:sz="0"/>
-            </w:tcBorders>
-            <w:tcMar>
-              <w:top w:type="dxa" w:w="110"/>
-              <w:left w:type="dxa" w:w="0"/>
-              <w:bottom w:type="dxa" w:w="110"/>
-              <w:right w:type="dxa" w:w="120"/>
-            </w:tcMar>
-          </w:tcPr>
-          <w:p>
-            <w:pPr>
-              <w:keepNext/>
-              <w:jc w:val="left"/>
-            </w:pPr>
-            <w:r>
-              <w:rPr>
-                <w:rFonts w:ascii="Montserrat" w:cs="Montserrat" w:eastAsia="Montserrat" w:hAnsi="Montserrat"/>
-                <w:color w:val="000000"/>
-                <w:sz w:val="20"/>
-                <w:szCs w:val="20"/>
-              </w:rPr>
-              <w:t xml:space="preserve">Spring semester</w:t>
-            </w:r>
-          </w:p>
-        </w:tc>
-        <w:tc>
-          <w:tcPr>
-            <w:tcW w:type="dxa" w:w="3120"/>
-            <w:tcBorders>
-              <w:top w:val="none" w:color="FFFFFF" w:sz="0"/>
-              <w:left w:val="none" w:color="FFFFFF" w:sz="0"/>
-              <w:bottom w:val="single" w:color="E4E4E6" w:sz="4"/>
-              <w:right w:val="none" w:color="FFFFFF" w:sz="0"/>
-            </w:tcBorders>
-            <w:tcMar>
-              <w:top w:type="dxa" w:w="110"/>
-              <w:left w:type="dxa" w:w="0"/>
-              <w:bottom w:type="dxa" w:w="110"/>
-              <w:right w:type="dxa" w:w="120"/>
-            </w:tcMar>
-          </w:tcPr>
-          <w:p>
-            <w:pPr>
-              <w:keepNext/>
-              <w:jc w:val="left"/>
-            </w:pPr>
-            <w:r>
-              <w:rPr>
-                <w:rFonts w:ascii="Roboto Serif" w:cs="Roboto Serif" w:eastAsia="Roboto Serif" w:hAnsi="Roboto Serif"/>
-                <w:color w:val="000000"/>
-                <w:sz w:val="22"/>
-                <w:szCs w:val="22"/>
-              </w:rPr>
-              <w:t xml:space="preserve">End of week 7 of Fall</w:t>
-            </w:r>
-          </w:p>
-        </w:tc>
-        <w:tc>
-          <w:tcPr>
-            <w:tcW w:type="dxa" w:w="3120"/>
-            <w:tcBorders>
-              <w:top w:val="none" w:color="FFFFFF" w:sz="0"/>
-              <w:left w:val="none" w:color="FFFFFF" w:sz="0"/>
-              <w:bottom w:val="single" w:color="E4E4E6" w:sz="4"/>
-              <w:right w:val="none" w:color="FFFFFF" w:sz="0"/>
-            </w:tcBorders>
-            <w:tcMar>
-              <w:top w:type="dxa" w:w="110"/>
-              <w:left w:type="dxa" w:w="0"/>
-              <w:bottom w:type="dxa" w:w="110"/>
-              <w:right w:type="dxa" w:w="120"/>
-            </w:tcMar>
-          </w:tcPr>
-          <w:p>
-            <w:pPr>
-              <w:keepNext/>
-              <w:jc w:val="right"/>
-            </w:pPr>
-            <w:r>
-              <w:rPr>
-                <w:rFonts w:ascii="Roboto Serif" w:cs="Roboto Serif" w:eastAsia="Roboto Serif" w:hAnsi="Roboto Serif"/>
-                <w:color w:val="000000"/>
-                <w:sz w:val="22"/>
-                <w:szCs w:val="22"/>
-              </w:rPr>
-              <w:t xml:space="preserve">End of week 9 of Fall</w:t>
-            </w:r>
-          </w:p>
-        </w:tc>
-      </w:tr>
-      <w:tr>
-        <w:trPr>
-          <w:cantSplit/>
-        </w:trPr>
-        <w:tc>
-          <w:tcPr>
-            <w:tcW w:type="dxa" w:w="3120"/>
-            <w:tcBorders>
-              <w:top w:val="none" w:color="FFFFFF" w:sz="0"/>
-              <w:left w:val="none" w:color="FFFFFF" w:sz="0"/>
-              <w:bottom w:val="none" w:color="FFFFFF" w:sz="0"/>
-              <w:right w:val="none" w:color="FFFFFF" w:sz="0"/>
-            </w:tcBorders>
-            <w:tcMar>
-              <w:top w:type="dxa" w:w="110"/>
-              <w:left w:type="dxa" w:w="0"/>
-              <w:bottom w:type="dxa" w:w="110"/>
-              <w:right w:type="dxa" w:w="120"/>
-            </w:tcMar>
-          </w:tcPr>
-          <w:p>
-            <w:pPr>
-              <w:jc w:val="left"/>
-            </w:pPr>
-            <w:r>
-              <w:rPr>
-                <w:rFonts w:ascii="Montserrat" w:cs="Montserrat" w:eastAsia="Montserrat" w:hAnsi="Montserrat"/>
-                <w:color w:val="000000"/>
-                <w:sz w:val="20"/>
-                <w:szCs w:val="20"/>
-              </w:rPr>
-              <w:t xml:space="preserve">Fall semester</w:t>
-            </w:r>
-          </w:p>
-        </w:tc>
-        <w:tc>
-          <w:tcPr>
-            <w:tcW w:type="dxa" w:w="3120"/>
-            <w:tcBorders>
-              <w:top w:val="none" w:color="FFFFFF" w:sz="0"/>
-              <w:left w:val="none" w:color="FFFFFF" w:sz="0"/>
-              <w:bottom w:val="none" w:color="FFFFFF" w:sz="0"/>
-              <w:right w:val="none" w:color="FFFFFF" w:sz="0"/>
-            </w:tcBorders>
-            <w:tcMar>
-              <w:top w:type="dxa" w:w="110"/>
-              <w:left w:type="dxa" w:w="0"/>
-              <w:bottom w:type="dxa" w:w="110"/>
-              <w:right w:type="dxa" w:w="120"/>
-            </w:tcMar>
-          </w:tcPr>
-          <w:p>
-            <w:pPr>
-              <w:jc w:val="left"/>
-            </w:pPr>
-            <w:r>
-              <w:rPr>
-                <w:rFonts w:ascii="Roboto Serif" w:cs="Roboto Serif" w:eastAsia="Roboto Serif" w:hAnsi="Roboto Serif"/>
-                <w:color w:val="000000"/>
-                <w:sz w:val="22"/>
-                <w:szCs w:val="22"/>
-              </w:rPr>
-              <w:t xml:space="preserve">End of week 7 of Spring</w:t>
-            </w:r>
-          </w:p>
-        </w:tc>
-        <w:tc>
-          <w:tcPr>
-            <w:tcW w:type="dxa" w:w="3120"/>
-            <w:tcBorders>
-              <w:top w:val="none" w:color="FFFFFF" w:sz="0"/>
-              <w:left w:val="none" w:color="FFFFFF" w:sz="0"/>
-              <w:bottom w:val="none" w:color="FFFFFF" w:sz="0"/>
-              <w:right w:val="none" w:color="FFFFFF" w:sz="0"/>
-            </w:tcBorders>
-            <w:tcMar>
-              <w:top w:type="dxa" w:w="110"/>
-              <w:left w:type="dxa" w:w="0"/>
-              <w:bottom w:type="dxa" w:w="110"/>
-              <w:right w:type="dxa" w:w="120"/>
-            </w:tcMar>
-          </w:tcPr>
-          <w:p>
-            <w:pPr>
-              <w:jc w:val="right"/>
-            </w:pPr>
-            <w:r>
-              <w:rPr>
-                <w:rFonts w:ascii="Roboto Serif" w:cs="Roboto Serif" w:eastAsia="Roboto Serif" w:hAnsi="Roboto Serif"/>
-                <w:color w:val="000000"/>
-                <w:sz w:val="22"/>
-                <w:szCs w:val="22"/>
-              </w:rPr>
-              <w:t xml:space="preserve">End of week 9 of Spring</w:t>
-            </w:r>
-          </w:p>
-        </w:tc>
-      </w:tr>
-    </w:tbl>
-    <w:p>
-      <w:pPr>
-        <w:spacing w:after="120" w:line="330"/>
-      </w:pPr>
-    </w:p>
-    <w:p>
-      <w:pPr>
-        <w:spacing w:after="160" w:line="330"/>
-      </w:pPr>
+        <w:t xml:space="preserve">I’m enrolled in the B.A. in Music at CSU East Bay.</w:t>
+      </w:r>
+    </w:p>
+    <w:p>
+      <w:pPr>
+        <w:tabs>
+          <w:tab w:val="left" w:pos="400"/>
+        </w:tabs>
+        <w:spacing w:after="90" w:line="320"/>
+        <w:ind w:left="400" w:hanging="400"/>
+      </w:pPr>
+      <w:sdt>
+        <w:sdtPr>
+          <w:rPr>
+            <w:rFonts w:ascii="MS Gothic" w:eastAsia="MS Gothic" w:hAnsi="MS Gothic"/>
+            <w:sz w:val="22"/>
+          </w:rPr>
+          <w14:checkbox>
+            <w14:checked w14:val="0"/>
+            <w14:checkedState w14:val="2612" w14:font="MS Gothic"/>
+            <w14:uncheckedState w14:val="2610" w14:font="MS Gothic"/>
+          </w14:checkbox>
+        </w:sdtPr>
+        <w:sdtContent>
+          <w:r>
+            <w:rPr>
+              <w:rFonts w:ascii="MS Gothic" w:eastAsia="MS Gothic" w:hAnsi="MS Gothic"/>
+              <w:sz w:val="22"/>
+            </w:rPr>
+            <w:t>☐</w:t>
+          </w:r>
+        </w:sdtContent>
+      </w:sdt>
+      <w:r>
+        <w:tab/>
+      </w:r>
       <w:r>
         <w:rPr>
           <w:rFonts w:ascii="Roboto Serif" w:cs="Roboto Serif" w:eastAsia="Roboto Serif" w:hAnsi="Roboto Serif"/>
@@ -942,7 +511,366 @@
           <w:sz w:val="22"/>
           <w:szCs w:val="22"/>
         </w:rPr>
-        <w:t xml:space="preserve">Applications received after week 7 are reviewed in the next window.</w:t>
+        <w:t xml:space="preserve">I’ve completed 60 to 90 program-applicable units.</w:t>
+      </w:r>
+    </w:p>
+    <w:p>
+      <w:pPr>
+        <w:tabs>
+          <w:tab w:val="left" w:pos="400"/>
+        </w:tabs>
+        <w:spacing w:after="90" w:line="320"/>
+        <w:ind w:left="400" w:hanging="400"/>
+      </w:pPr>
+      <w:sdt>
+        <w:sdtPr>
+          <w:rPr>
+            <w:rFonts w:ascii="MS Gothic" w:eastAsia="MS Gothic" w:hAnsi="MS Gothic"/>
+            <w:sz w:val="22"/>
+          </w:rPr>
+          <w14:checkbox>
+            <w14:checked w14:val="0"/>
+            <w14:checkedState w14:val="2612" w14:font="MS Gothic"/>
+            <w14:uncheckedState w14:val="2610" w14:font="MS Gothic"/>
+          </w14:checkbox>
+        </w:sdtPr>
+        <w:sdtContent>
+          <w:r>
+            <w:rPr>
+              <w:rFonts w:ascii="MS Gothic" w:eastAsia="MS Gothic" w:hAnsi="MS Gothic"/>
+              <w:sz w:val="22"/>
+            </w:rPr>
+            <w:t>☐</w:t>
+          </w:r>
+        </w:sdtContent>
+      </w:sdt>
+      <w:r>
+        <w:tab/>
+      </w:r>
+      <w:r>
+        <w:rPr>
+          <w:rFonts w:ascii="Roboto Serif" w:cs="Roboto Serif" w:eastAsia="Roboto Serif" w:hAnsi="Roboto Serif"/>
+          <w:color w:val="000000"/>
+          <w:sz w:val="22"/>
+          <w:szCs w:val="22"/>
+        </w:rPr>
+        <w:t xml:space="preserve">I’ve completed the lower-division core music coursework (15 units) and the lower-division general education requirements.</w:t>
+      </w:r>
+    </w:p>
+    <w:p>
+      <w:pPr>
+        <w:tabs>
+          <w:tab w:val="left" w:pos="400"/>
+        </w:tabs>
+        <w:spacing w:after="90" w:line="320"/>
+        <w:ind w:left="400" w:hanging="400"/>
+      </w:pPr>
+      <w:sdt>
+        <w:sdtPr>
+          <w:rPr>
+            <w:rFonts w:ascii="MS Gothic" w:eastAsia="MS Gothic" w:hAnsi="MS Gothic"/>
+            <w:sz w:val="22"/>
+          </w:rPr>
+          <w14:checkbox>
+            <w14:checked w14:val="0"/>
+            <w14:checkedState w14:val="2612" w14:font="MS Gothic"/>
+            <w14:uncheckedState w14:val="2610" w14:font="MS Gothic"/>
+          </w14:checkbox>
+        </w:sdtPr>
+        <w:sdtContent>
+          <w:r>
+            <w:rPr>
+              <w:rFonts w:ascii="MS Gothic" w:eastAsia="MS Gothic" w:hAnsi="MS Gothic"/>
+              <w:sz w:val="22"/>
+            </w:rPr>
+            <w:t>☐</w:t>
+          </w:r>
+        </w:sdtContent>
+      </w:sdt>
+      <w:r>
+        <w:tab/>
+      </w:r>
+      <w:r>
+        <w:rPr>
+          <w:rFonts w:ascii="Roboto Serif" w:cs="Roboto Serif" w:eastAsia="Roboto Serif" w:hAnsi="Roboto Serif"/>
+          <w:color w:val="000000"/>
+          <w:sz w:val="22"/>
+          <w:szCs w:val="22"/>
+        </w:rPr>
+        <w:t xml:space="preserve">My cumulative GPA in music courses is at least 3.0.</w:t>
+      </w:r>
+    </w:p>
+    <w:p>
+      <w:pPr>
+        <w:keepNext/>
+        <w:spacing w:before="180" w:after="80"/>
+      </w:pPr>
+      <w:r>
+        <w:rPr>
+          <w:rFonts w:ascii="Montserrat" w:cs="Montserrat" w:eastAsia="Montserrat" w:hAnsi="Montserrat"/>
+          <w:color w:val="55575B"/>
+          <w:sz w:val="18"/>
+          <w:szCs w:val="18"/>
+        </w:rPr>
+        <w:t xml:space="preserve">Materials and submission</w:t>
+      </w:r>
+    </w:p>
+    <w:p>
+      <w:pPr>
+        <w:tabs>
+          <w:tab w:val="left" w:pos="400"/>
+        </w:tabs>
+        <w:spacing w:after="90" w:line="320"/>
+        <w:ind w:left="400" w:hanging="400"/>
+      </w:pPr>
+      <w:sdt>
+        <w:sdtPr>
+          <w:rPr>
+            <w:rFonts w:ascii="MS Gothic" w:eastAsia="MS Gothic" w:hAnsi="MS Gothic"/>
+            <w:sz w:val="22"/>
+          </w:rPr>
+          <w14:checkbox>
+            <w14:checked w14:val="0"/>
+            <w14:checkedState w14:val="2612" w14:font="MS Gothic"/>
+            <w14:uncheckedState w14:val="2610" w14:font="MS Gothic"/>
+          </w14:checkbox>
+        </w:sdtPr>
+        <w:sdtContent>
+          <w:r>
+            <w:rPr>
+              <w:rFonts w:ascii="MS Gothic" w:eastAsia="MS Gothic" w:hAnsi="MS Gothic"/>
+              <w:sz w:val="22"/>
+            </w:rPr>
+            <w:t>☐</w:t>
+          </w:r>
+        </w:sdtContent>
+      </w:sdt>
+      <w:r>
+        <w:tab/>
+      </w:r>
+      <w:r>
+        <w:rPr>
+          <w:rFonts w:ascii="Roboto Serif" w:cs="Roboto Serif" w:eastAsia="Roboto Serif" w:hAnsi="Roboto Serif"/>
+          <w:color w:val="000000"/>
+          <w:sz w:val="22"/>
+          <w:szCs w:val="22"/>
+        </w:rPr>
+        <w:t xml:space="preserve">Curriculum vitae (CV) or résumé, as a PDF.</w:t>
+      </w:r>
+    </w:p>
+    <w:p>
+      <w:pPr>
+        <w:tabs>
+          <w:tab w:val="left" w:pos="400"/>
+        </w:tabs>
+        <w:spacing w:after="90" w:line="320"/>
+        <w:ind w:left="400" w:hanging="400"/>
+      </w:pPr>
+      <w:sdt>
+        <w:sdtPr>
+          <w:rPr>
+            <w:rFonts w:ascii="MS Gothic" w:eastAsia="MS Gothic" w:hAnsi="MS Gothic"/>
+            <w:sz w:val="22"/>
+          </w:rPr>
+          <w14:checkbox>
+            <w14:checked w14:val="0"/>
+            <w14:checkedState w14:val="2612" w14:font="MS Gothic"/>
+            <w14:uncheckedState w14:val="2610" w14:font="MS Gothic"/>
+          </w14:checkbox>
+        </w:sdtPr>
+        <w:sdtContent>
+          <w:r>
+            <w:rPr>
+              <w:rFonts w:ascii="MS Gothic" w:eastAsia="MS Gothic" w:hAnsi="MS Gothic"/>
+              <w:sz w:val="22"/>
+            </w:rPr>
+            <w:t>☐</w:t>
+          </w:r>
+        </w:sdtContent>
+      </w:sdt>
+      <w:r>
+        <w:tab/>
+      </w:r>
+      <w:r>
+        <w:rPr>
+          <w:rFonts w:ascii="Roboto Serif" w:cs="Roboto Serif" w:eastAsia="Roboto Serif" w:hAnsi="Roboto Serif"/>
+          <w:color w:val="000000"/>
+          <w:sz w:val="22"/>
+          <w:szCs w:val="22"/>
+        </w:rPr>
+        <w:t xml:space="preserve">Statement of purpose (2 pages), as a PDF.</w:t>
+      </w:r>
+    </w:p>
+    <w:p>
+      <w:pPr>
+        <w:tabs>
+          <w:tab w:val="left" w:pos="400"/>
+        </w:tabs>
+        <w:spacing w:after="90" w:line="320"/>
+        <w:ind w:left="400" w:hanging="400"/>
+      </w:pPr>
+      <w:sdt>
+        <w:sdtPr>
+          <w:rPr>
+            <w:rFonts w:ascii="MS Gothic" w:eastAsia="MS Gothic" w:hAnsi="MS Gothic"/>
+            <w:sz w:val="22"/>
+          </w:rPr>
+          <w14:checkbox>
+            <w14:checked w14:val="0"/>
+            <w14:checkedState w14:val="2612" w14:font="MS Gothic"/>
+            <w14:uncheckedState w14:val="2610" w14:font="MS Gothic"/>
+          </w14:checkbox>
+        </w:sdtPr>
+        <w:sdtContent>
+          <w:r>
+            <w:rPr>
+              <w:rFonts w:ascii="MS Gothic" w:eastAsia="MS Gothic" w:hAnsi="MS Gothic"/>
+              <w:sz w:val="22"/>
+            </w:rPr>
+            <w:t>☐</w:t>
+          </w:r>
+        </w:sdtContent>
+      </w:sdt>
+      <w:r>
+        <w:tab/>
+      </w:r>
+      <w:r>
+        <w:rPr>
+          <w:rFonts w:ascii="Roboto Serif" w:cs="Roboto Serif" w:eastAsia="Roboto Serif" w:hAnsi="Roboto Serif"/>
+          <w:color w:val="000000"/>
+          <w:sz w:val="22"/>
+          <w:szCs w:val="22"/>
+        </w:rPr>
+        <w:t xml:space="preserve">Evidence of abilities in my area of emphasis, as shareable links.</w:t>
+      </w:r>
+    </w:p>
+    <w:p>
+      <w:pPr>
+        <w:tabs>
+          <w:tab w:val="left" w:pos="400"/>
+        </w:tabs>
+        <w:spacing w:after="90" w:line="320"/>
+        <w:ind w:left="400" w:hanging="400"/>
+      </w:pPr>
+      <w:sdt>
+        <w:sdtPr>
+          <w:rPr>
+            <w:rFonts w:ascii="MS Gothic" w:eastAsia="MS Gothic" w:hAnsi="MS Gothic"/>
+            <w:sz w:val="22"/>
+          </w:rPr>
+          <w14:checkbox>
+            <w14:checked w14:val="0"/>
+            <w14:checkedState w14:val="2612" w14:font="MS Gothic"/>
+            <w14:uncheckedState w14:val="2610" w14:font="MS Gothic"/>
+          </w14:checkbox>
+        </w:sdtPr>
+        <w:sdtContent>
+          <w:r>
+            <w:rPr>
+              <w:rFonts w:ascii="MS Gothic" w:eastAsia="MS Gothic" w:hAnsi="MS Gothic"/>
+              <w:sz w:val="22"/>
+            </w:rPr>
+            <w:t>☐</w:t>
+          </w:r>
+        </w:sdtContent>
+      </w:sdt>
+      <w:r>
+        <w:tab/>
+      </w:r>
+      <w:r>
+        <w:rPr>
+          <w:rFonts w:ascii="Roboto Serif" w:cs="Roboto Serif" w:eastAsia="Roboto Serif" w:hAnsi="Roboto Serif"/>
+          <w:color w:val="000000"/>
+          <w:sz w:val="22"/>
+          <w:szCs w:val="22"/>
+        </w:rPr>
+        <w:t xml:space="preserve">Application form (section 04), completed, as a PDF.</w:t>
+      </w:r>
+    </w:p>
+    <w:p>
+      <w:pPr>
+        <w:tabs>
+          <w:tab w:val="left" w:pos="400"/>
+        </w:tabs>
+        <w:spacing w:after="90" w:line="320"/>
+        <w:ind w:left="400" w:hanging="400"/>
+      </w:pPr>
+      <w:sdt>
+        <w:sdtPr>
+          <w:rPr>
+            <w:rFonts w:ascii="MS Gothic" w:eastAsia="MS Gothic" w:hAnsi="MS Gothic"/>
+            <w:sz w:val="22"/>
+          </w:rPr>
+          <w14:checkbox>
+            <w14:checked w14:val="0"/>
+            <w14:checkedState w14:val="2612" w14:font="MS Gothic"/>
+            <w14:uncheckedState w14:val="2610" w14:font="MS Gothic"/>
+          </w14:checkbox>
+        </w:sdtPr>
+        <w:sdtContent>
+          <w:r>
+            <w:rPr>
+              <w:rFonts w:ascii="MS Gothic" w:eastAsia="MS Gothic" w:hAnsi="MS Gothic"/>
+              <w:sz w:val="22"/>
+            </w:rPr>
+            <w:t>☐</w:t>
+          </w:r>
+        </w:sdtContent>
+      </w:sdt>
+      <w:r>
+        <w:tab/>
+      </w:r>
+      <w:r>
+        <w:rPr>
+          <w:rFonts w:ascii="Roboto Serif" w:cs="Roboto Serif" w:eastAsia="Roboto Serif" w:hAnsi="Roboto Serif"/>
+          <w:color w:val="000000"/>
+          <w:sz w:val="22"/>
+          <w:szCs w:val="22"/>
+        </w:rPr>
+        <w:t xml:space="preserve">2 recommenders asked, and given the deadline and the Graduate Coordinator’s email address.</w:t>
+      </w:r>
+    </w:p>
+    <w:p>
+      <w:pPr>
+        <w:tabs>
+          <w:tab w:val="left" w:pos="400"/>
+        </w:tabs>
+        <w:spacing w:after="90" w:line="320"/>
+        <w:ind w:left="400" w:hanging="400"/>
+      </w:pPr>
+      <w:sdt>
+        <w:sdtPr>
+          <w:rPr>
+            <w:rFonts w:ascii="MS Gothic" w:eastAsia="MS Gothic" w:hAnsi="MS Gothic"/>
+            <w:sz w:val="22"/>
+          </w:rPr>
+          <w14:checkbox>
+            <w14:checked w14:val="0"/>
+            <w14:checkedState w14:val="2612" w14:font="MS Gothic"/>
+            <w14:uncheckedState w14:val="2610" w14:font="MS Gothic"/>
+          </w14:checkbox>
+        </w:sdtPr>
+        <w:sdtContent>
+          <w:r>
+            <w:rPr>
+              <w:rFonts w:ascii="MS Gothic" w:eastAsia="MS Gothic" w:hAnsi="MS Gothic"/>
+              <w:sz w:val="22"/>
+            </w:rPr>
+            <w:t>☐</w:t>
+          </w:r>
+        </w:sdtContent>
+      </w:sdt>
+      <w:r>
+        <w:tab/>
+      </w:r>
+      <w:r>
+        <w:rPr>
+          <w:rFonts w:ascii="Roboto Serif" w:cs="Roboto Serif" w:eastAsia="Roboto Serif" w:hAnsi="Roboto Serif"/>
+          <w:color w:val="000000"/>
+          <w:sz w:val="22"/>
+          <w:szCs w:val="22"/>
+        </w:rPr>
+        <w:t xml:space="preserve">Everything sent in one email by the end of week 7.</w:t>
       </w:r>
     </w:p>
     <w:p>
@@ -959,180 +887,7 @@
           <w:sz w:val="26"/>
           <w:szCs w:val="26"/>
         </w:rPr>
-        <w:t xml:space="preserve">04  </w:t>
-      </w:r>
-      <w:r>
-        <w:rPr>
-          <w:rFonts w:ascii="Montserrat" w:cs="Montserrat" w:eastAsia="Montserrat" w:hAnsi="Montserrat"/>
-          <w:b/>
-          <w:bCs/>
-          <w:color w:val="000000"/>
-          <w:sz w:val="26"/>
-          <w:szCs w:val="26"/>
-        </w:rPr>
-        <w:t xml:space="preserve">What to prepare</w:t>
-      </w:r>
-    </w:p>
-    <w:p>
-      <w:pPr>
-        <w:numPr>
-          <w:ilvl w:val="0"/>
-          <w:numId w:val="2"/>
-        </w:numPr>
-        <w:spacing w:after="100" w:line="320"/>
-      </w:pPr>
-      <w:r>
-        <w:rPr>
-          <w:rFonts w:ascii="Roboto Serif" w:cs="Roboto Serif" w:eastAsia="Roboto Serif" w:hAnsi="Roboto Serif"/>
-          <w:color w:val="000000"/>
-          <w:sz w:val="22"/>
-          <w:szCs w:val="22"/>
-        </w:rPr>
-        <w:t xml:space="preserve">The application form in section 07, filled in.</w:t>
-      </w:r>
-    </w:p>
-    <w:p>
-      <w:pPr>
-        <w:numPr>
-          <w:ilvl w:val="0"/>
-          <w:numId w:val="2"/>
-        </w:numPr>
-        <w:spacing w:after="100" w:line="320"/>
-      </w:pPr>
-      <w:r>
-        <w:rPr>
-          <w:rFonts w:ascii="Roboto Serif" w:cs="Roboto Serif" w:eastAsia="Roboto Serif" w:hAnsi="Roboto Serif"/>
-          <w:color w:val="000000"/>
-          <w:sz w:val="22"/>
-          <w:szCs w:val="22"/>
-        </w:rPr>
-        <w:t xml:space="preserve">A statement of purpose of 1 to 2 pages, setting out your academic and musical goals for the B.A./M.A. and how the program fits your long-term plans.</w:t>
-      </w:r>
-    </w:p>
-    <w:p>
-      <w:pPr>
-        <w:numPr>
-          <w:ilvl w:val="0"/>
-          <w:numId w:val="2"/>
-        </w:numPr>
-        <w:spacing w:after="100" w:line="320"/>
-      </w:pPr>
-      <w:r>
-        <w:rPr>
-          <w:rFonts w:ascii="Roboto Serif" w:cs="Roboto Serif" w:eastAsia="Roboto Serif" w:hAnsi="Roboto Serif"/>
-          <w:color w:val="000000"/>
-          <w:sz w:val="22"/>
-          <w:szCs w:val="22"/>
-        </w:rPr>
-        <w:t xml:space="preserve">Two letters of recommendation from Music faculty who can speak to your academic work and your musicianship. Ask your recommenders to email their letters directly to the Graduate Coordinator, with your name in the subject line.</w:t>
-      </w:r>
-    </w:p>
-    <w:p>
-      <w:pPr>
-        <w:numPr>
-          <w:ilvl w:val="0"/>
-          <w:numId w:val="2"/>
-        </w:numPr>
-        <w:spacing w:after="100" w:line="320"/>
-      </w:pPr>
-      <w:r>
-        <w:rPr>
-          <w:rFonts w:ascii="Roboto Serif" w:cs="Roboto Serif" w:eastAsia="Roboto Serif" w:hAnsi="Roboto Serif"/>
-          <w:color w:val="000000"/>
-          <w:sz w:val="22"/>
-          <w:szCs w:val="22"/>
-        </w:rPr>
-        <w:t xml:space="preserve">Evidence of your work in your area of emphasis.</w:t>
-      </w:r>
-    </w:p>
-    <w:p>
-      <w:pPr>
-        <w:spacing w:after="60" w:line="330"/>
-      </w:pPr>
-    </w:p>
-    <w:p>
-      <w:pPr>
-        <w:spacing w:after="100" w:line="330"/>
-      </w:pPr>
-      <w:r>
-        <w:rPr>
-          <w:rFonts w:ascii="Roboto Serif" w:cs="Roboto Serif" w:eastAsia="Roboto Serif" w:hAnsi="Roboto Serif"/>
-          <w:color w:val="000000"/>
-          <w:sz w:val="22"/>
-          <w:szCs w:val="22"/>
-        </w:rPr>
-        <w:t xml:space="preserve">The evidence depends on your area of emphasis:</w:t>
-      </w:r>
-    </w:p>
-    <w:p>
-      <w:pPr>
-        <w:numPr>
-          <w:ilvl w:val="0"/>
-          <w:numId w:val="1"/>
-        </w:numPr>
-        <w:spacing w:after="100" w:line="320"/>
-      </w:pPr>
-      <w:r>
-        <w:rPr>
-          <w:rFonts w:ascii="Roboto Serif" w:cs="Roboto Serif" w:eastAsia="Roboto Serif" w:hAnsi="Roboto Serif"/>
-          <w:color w:val="000000"/>
-          <w:sz w:val="22"/>
-          <w:szCs w:val="22"/>
-        </w:rPr>
-        <w:t xml:space="preserve">If your emphasis is Performance (Classical or Jazz), send recordings of your playing or singing, or ask for a live audition in your application email.</w:t>
-      </w:r>
-    </w:p>
-    <w:p>
-      <w:pPr>
-        <w:numPr>
-          <w:ilvl w:val="0"/>
-          <w:numId w:val="1"/>
-        </w:numPr>
-        <w:spacing w:after="100" w:line="320"/>
-      </w:pPr>
-      <w:r>
-        <w:rPr>
-          <w:rFonts w:ascii="Roboto Serif" w:cs="Roboto Serif" w:eastAsia="Roboto Serif" w:hAnsi="Roboto Serif"/>
-          <w:color w:val="000000"/>
-          <w:sz w:val="22"/>
-          <w:szCs w:val="22"/>
-        </w:rPr>
-        <w:t xml:space="preserve">If your emphasis is Choral Conducting, send a video of you conducting a rehearsal or a performance.</w:t>
-      </w:r>
-    </w:p>
-    <w:p>
-      <w:pPr>
-        <w:numPr>
-          <w:ilvl w:val="0"/>
-          <w:numId w:val="1"/>
-        </w:numPr>
-        <w:spacing w:after="100" w:line="320"/>
-      </w:pPr>
-      <w:r>
-        <w:rPr>
-          <w:rFonts w:ascii="Roboto Serif" w:cs="Roboto Serif" w:eastAsia="Roboto Serif" w:hAnsi="Roboto Serif"/>
-          <w:color w:val="000000"/>
-          <w:sz w:val="22"/>
-          <w:szCs w:val="22"/>
-        </w:rPr>
-        <w:t xml:space="preserve">If your emphasis is Composition, send scores of your original compositions, with recordings where you have them.</w:t>
-      </w:r>
-    </w:p>
-    <w:p>
-      <w:pPr>
-        <w:keepNext/>
-        <w:spacing w:after="130" w:before="260"/>
-      </w:pPr>
-      <w:r>
-        <w:rPr>
-          <w:rFonts w:ascii="Montserrat" w:cs="Montserrat" w:eastAsia="Montserrat" w:hAnsi="Montserrat"/>
-          <w:b/>
-          <w:bCs/>
-          <w:color w:val="D50032"/>
-          <w:sz w:val="26"/>
-          <w:szCs w:val="26"/>
-        </w:rPr>
-        <w:t xml:space="preserve">05  </w:t>
+        <w:t xml:space="preserve">03  </w:t>
       </w:r>
       <w:r>
         <w:rPr>
@@ -1178,7 +933,7 @@
           <w:sz w:val="22"/>
           <w:szCs w:val="22"/>
         </w:rPr>
-        <w:t xml:space="preserve">, with the subject line “FAST application: last name, first name.” Attach the application form and the statement of purpose as PDFs. Send recordings, videos, and scores as shareable links set so that anyone with the link can view them, and list the links on the application form.</w:t>
+        <w:t xml:space="preserve">, with the subject line “FAST application: last name, first name.” Attach the CV or résumé, the statement of purpose, and the application form as PDFs. Send the evidence of abilities as shareable links set so that anyone with the link can view them, and list the links on the application form.</w:t>
       </w:r>
     </w:p>
     <w:p>
@@ -1192,8 +947,13 @@
           <w:sz w:val="22"/>
           <w:szCs w:val="22"/>
         </w:rPr>
-        <w:t xml:space="preserve">Questions go to the Graduate Coordinator, Inés Thiebaut, in MB 2012 or at 510</w:t>
-      </w:r>
+        <w:t xml:space="preserve">Your recommenders email their letters to the same address, with your name in the subject line, by the same deadline.</w:t>
+      </w:r>
+    </w:p>
+    <w:p>
+      <w:pPr>
+        <w:spacing w:after="160" w:line="330"/>
+      </w:pPr>
       <w:r>
         <w:rPr>
           <w:rFonts w:ascii="Roboto Serif" w:cs="Roboto Serif" w:eastAsia="Roboto Serif" w:hAnsi="Roboto Serif"/>
@@ -1201,6 +961,15 @@
           <w:sz w:val="22"/>
           <w:szCs w:val="22"/>
         </w:rPr>
+        <w:t xml:space="preserve">Questions go to the Graduate Coordinator, Inés Thiebaut, in MB 2012 or at 510</w:t>
+      </w:r>
+      <w:r>
+        <w:rPr>
+          <w:rFonts w:ascii="Roboto Serif" w:cs="Roboto Serif" w:eastAsia="Roboto Serif" w:hAnsi="Roboto Serif"/>
+          <w:color w:val="000000"/>
+          <w:sz w:val="22"/>
+          <w:szCs w:val="22"/>
+        </w:rPr>
         <w:noBreakHyphen/>
         <w:t>885</w:t>
         <w:noBreakHyphen/>
@@ -1210,6 +979,7 @@
     <w:p>
       <w:pPr>
         <w:keepNext/>
+        <w:pageBreakBefore/>
         <w:spacing w:after="130" w:before="260"/>
       </w:pPr>
       <w:r>
@@ -1221,64 +991,7 @@
           <w:sz w:val="26"/>
           <w:szCs w:val="26"/>
         </w:rPr>
-        <w:t xml:space="preserve">06  </w:t>
-      </w:r>
-      <w:r>
-        <w:rPr>
-          <w:rFonts w:ascii="Montserrat" w:cs="Montserrat" w:eastAsia="Montserrat" w:hAnsi="Montserrat"/>
-          <w:b/>
-          <w:bCs/>
-          <w:color w:val="000000"/>
-          <w:sz w:val="26"/>
-          <w:szCs w:val="26"/>
-        </w:rPr>
-        <w:t xml:space="preserve">After you apply</w:t>
-      </w:r>
-    </w:p>
-    <w:p>
-      <w:pPr>
-        <w:spacing w:after="160" w:line="330"/>
-      </w:pPr>
-      <w:r>
-        <w:rPr>
-          <w:rFonts w:ascii="Roboto Serif" w:cs="Roboto Serif" w:eastAsia="Roboto Serif" w:hAnsi="Roboto Serif"/>
-          <w:color w:val="000000"/>
-          <w:sz w:val="22"/>
-          <w:szCs w:val="22"/>
-        </w:rPr>
-        <w:t xml:space="preserve">The Graduate Coordinator is the FAST advisor for Music. The Graduate Coordinator reviews complete applications and emails you a decision by the end of week 9.</w:t>
-      </w:r>
-    </w:p>
-    <w:p>
-      <w:pPr>
-        <w:spacing w:after="160" w:line="330"/>
-      </w:pPr>
-      <w:r>
-        <w:rPr>
-          <w:rFonts w:ascii="Roboto Serif" w:cs="Roboto Serif" w:eastAsia="Roboto Serif" w:hAnsi="Roboto Serif"/>
-          <w:color w:val="000000"/>
-          <w:sz w:val="22"/>
-          <w:szCs w:val="22"/>
-        </w:rPr>
-        <w:t xml:space="preserve">If you’re admitted, the Graduate Coordinator files the university FAST Application Form. You, the Graduate Coordinator, and a representative of the undergraduate program each approve it, and the Office of the Registrar then moves you onto the FAST academic plan. Admission takes effect when the form is approved. You register for your first FAST semester under the roadmap for your entry path, and from then on you meet with the Graduate Coordinator every semester.</w:t>
-      </w:r>
-    </w:p>
-    <w:p>
-      <w:pPr>
-        <w:keepNext/>
-        <w:pageBreakBefore/>
-        <w:spacing w:after="130" w:before="260"/>
-      </w:pPr>
-      <w:r>
-        <w:rPr>
-          <w:rFonts w:ascii="Montserrat" w:cs="Montserrat" w:eastAsia="Montserrat" w:hAnsi="Montserrat"/>
-          <w:b/>
-          <w:bCs/>
-          <w:color w:val="D50032"/>
-          <w:sz w:val="26"/>
-          <w:szCs w:val="26"/>
-        </w:rPr>
-        <w:t xml:space="preserve">07  </w:t>
+        <w:t xml:space="preserve">04  </w:t>
       </w:r>
       <w:r>
         <w:rPr>
@@ -1337,9 +1050,9 @@
               <w:right w:val="none" w:color="FFFFFF" w:sz="0"/>
             </w:tcBorders>
             <w:tcMar>
-              <w:top w:type="dxa" w:w="90"/>
-              <w:left w:type="dxa" w:w="0"/>
-              <w:bottom w:type="dxa" w:w="90"/>
+              <w:top w:type="dxa" w:w="110"/>
+              <w:left w:type="dxa" w:w="0"/>
+              <w:bottom w:type="dxa" w:w="110"/>
               <w:right w:type="dxa" w:w="120"/>
             </w:tcMar>
           </w:tcPr>
@@ -1368,9 +1081,9 @@
               <w:right w:val="none" w:color="FFFFFF" w:sz="0"/>
             </w:tcBorders>
             <w:tcMar>
-              <w:top w:type="dxa" w:w="90"/>
-              <w:left w:type="dxa" w:w="0"/>
-              <w:bottom w:type="dxa" w:w="90"/>
+              <w:top w:type="dxa" w:w="110"/>
+              <w:left w:type="dxa" w:w="0"/>
+              <w:bottom w:type="dxa" w:w="110"/>
               <w:right w:type="dxa" w:w="120"/>
             </w:tcMar>
           </w:tcPr>
@@ -1395,9 +1108,9 @@
               <w:right w:val="none" w:color="FFFFFF" w:sz="0"/>
             </w:tcBorders>
             <w:tcMar>
-              <w:top w:type="dxa" w:w="90"/>
-              <w:left w:type="dxa" w:w="0"/>
-              <w:bottom w:type="dxa" w:w="90"/>
+              <w:top w:type="dxa" w:w="110"/>
+              <w:left w:type="dxa" w:w="0"/>
+              <w:bottom w:type="dxa" w:w="110"/>
               <w:right w:type="dxa" w:w="120"/>
             </w:tcMar>
           </w:tcPr>
@@ -1426,9 +1139,9 @@
               <w:right w:val="none" w:color="FFFFFF" w:sz="0"/>
             </w:tcBorders>
             <w:tcMar>
-              <w:top w:type="dxa" w:w="90"/>
-              <w:left w:type="dxa" w:w="0"/>
-              <w:bottom w:type="dxa" w:w="90"/>
+              <w:top w:type="dxa" w:w="110"/>
+              <w:left w:type="dxa" w:w="0"/>
+              <w:bottom w:type="dxa" w:w="110"/>
               <w:right w:type="dxa" w:w="120"/>
             </w:tcMar>
           </w:tcPr>
@@ -1453,9 +1166,9 @@
               <w:right w:val="none" w:color="FFFFFF" w:sz="0"/>
             </w:tcBorders>
             <w:tcMar>
-              <w:top w:type="dxa" w:w="90"/>
-              <w:left w:type="dxa" w:w="0"/>
-              <w:bottom w:type="dxa" w:w="90"/>
+              <w:top w:type="dxa" w:w="110"/>
+              <w:left w:type="dxa" w:w="0"/>
+              <w:bottom w:type="dxa" w:w="110"/>
               <w:right w:type="dxa" w:w="120"/>
             </w:tcMar>
           </w:tcPr>
@@ -1484,9 +1197,9 @@
               <w:right w:val="none" w:color="FFFFFF" w:sz="0"/>
             </w:tcBorders>
             <w:tcMar>
-              <w:top w:type="dxa" w:w="90"/>
-              <w:left w:type="dxa" w:w="0"/>
-              <w:bottom w:type="dxa" w:w="90"/>
+              <w:top w:type="dxa" w:w="110"/>
+              <w:left w:type="dxa" w:w="0"/>
+              <w:bottom w:type="dxa" w:w="110"/>
               <w:right w:type="dxa" w:w="120"/>
             </w:tcMar>
           </w:tcPr>
@@ -1511,9 +1224,9 @@
               <w:right w:val="none" w:color="FFFFFF" w:sz="0"/>
             </w:tcBorders>
             <w:tcMar>
-              <w:top w:type="dxa" w:w="90"/>
-              <w:left w:type="dxa" w:w="0"/>
-              <w:bottom w:type="dxa" w:w="90"/>
+              <w:top w:type="dxa" w:w="110"/>
+              <w:left w:type="dxa" w:w="0"/>
+              <w:bottom w:type="dxa" w:w="110"/>
               <w:right w:type="dxa" w:w="120"/>
             </w:tcMar>
           </w:tcPr>
@@ -1542,9 +1255,9 @@
               <w:right w:val="none" w:color="FFFFFF" w:sz="0"/>
             </w:tcBorders>
             <w:tcMar>
-              <w:top w:type="dxa" w:w="90"/>
-              <w:left w:type="dxa" w:w="0"/>
-              <w:bottom w:type="dxa" w:w="90"/>
+              <w:top w:type="dxa" w:w="110"/>
+              <w:left w:type="dxa" w:w="0"/>
+              <w:bottom w:type="dxa" w:w="110"/>
               <w:right w:type="dxa" w:w="120"/>
             </w:tcMar>
           </w:tcPr>
@@ -1569,9 +1282,9 @@
               <w:right w:val="none" w:color="FFFFFF" w:sz="0"/>
             </w:tcBorders>
             <w:tcMar>
-              <w:top w:type="dxa" w:w="90"/>
-              <w:left w:type="dxa" w:w="0"/>
-              <w:bottom w:type="dxa" w:w="90"/>
+              <w:top w:type="dxa" w:w="110"/>
+              <w:left w:type="dxa" w:w="0"/>
+              <w:bottom w:type="dxa" w:w="110"/>
               <w:right w:type="dxa" w:w="120"/>
             </w:tcMar>
           </w:tcPr>
@@ -1600,9 +1313,9 @@
               <w:right w:val="none" w:color="FFFFFF" w:sz="0"/>
             </w:tcBorders>
             <w:tcMar>
-              <w:top w:type="dxa" w:w="90"/>
-              <w:left w:type="dxa" w:w="0"/>
-              <w:bottom w:type="dxa" w:w="90"/>
+              <w:top w:type="dxa" w:w="110"/>
+              <w:left w:type="dxa" w:w="0"/>
+              <w:bottom w:type="dxa" w:w="110"/>
               <w:right w:type="dxa" w:w="120"/>
             </w:tcMar>
           </w:tcPr>
@@ -1627,9 +1340,9 @@
               <w:right w:val="none" w:color="FFFFFF" w:sz="0"/>
             </w:tcBorders>
             <w:tcMar>
-              <w:top w:type="dxa" w:w="90"/>
-              <w:left w:type="dxa" w:w="0"/>
-              <w:bottom w:type="dxa" w:w="90"/>
+              <w:top w:type="dxa" w:w="110"/>
+              <w:left w:type="dxa" w:w="0"/>
+              <w:bottom w:type="dxa" w:w="110"/>
               <w:right w:type="dxa" w:w="120"/>
             </w:tcMar>
           </w:tcPr>
@@ -1658,9 +1371,9 @@
               <w:right w:val="none" w:color="FFFFFF" w:sz="0"/>
             </w:tcBorders>
             <w:tcMar>
-              <w:top w:type="dxa" w:w="90"/>
-              <w:left w:type="dxa" w:w="0"/>
-              <w:bottom w:type="dxa" w:w="90"/>
+              <w:top w:type="dxa" w:w="110"/>
+              <w:left w:type="dxa" w:w="0"/>
+              <w:bottom w:type="dxa" w:w="110"/>
               <w:right w:type="dxa" w:w="120"/>
             </w:tcMar>
           </w:tcPr>
@@ -1685,9 +1398,9 @@
               <w:right w:val="none" w:color="FFFFFF" w:sz="0"/>
             </w:tcBorders>
             <w:tcMar>
-              <w:top w:type="dxa" w:w="90"/>
-              <w:left w:type="dxa" w:w="0"/>
-              <w:bottom w:type="dxa" w:w="90"/>
+              <w:top w:type="dxa" w:w="110"/>
+              <w:left w:type="dxa" w:w="0"/>
+              <w:bottom w:type="dxa" w:w="110"/>
               <w:right w:type="dxa" w:w="120"/>
             </w:tcMar>
           </w:tcPr>
@@ -1716,9 +1429,9 @@
               <w:right w:val="none" w:color="FFFFFF" w:sz="0"/>
             </w:tcBorders>
             <w:tcMar>
-              <w:top w:type="dxa" w:w="90"/>
-              <w:left w:type="dxa" w:w="0"/>
-              <w:bottom w:type="dxa" w:w="90"/>
+              <w:top w:type="dxa" w:w="110"/>
+              <w:left w:type="dxa" w:w="0"/>
+              <w:bottom w:type="dxa" w:w="110"/>
               <w:right w:type="dxa" w:w="120"/>
             </w:tcMar>
           </w:tcPr>
@@ -1743,9 +1456,9 @@
               <w:right w:val="none" w:color="FFFFFF" w:sz="0"/>
             </w:tcBorders>
             <w:tcMar>
-              <w:top w:type="dxa" w:w="90"/>
-              <w:left w:type="dxa" w:w="0"/>
-              <w:bottom w:type="dxa" w:w="90"/>
+              <w:top w:type="dxa" w:w="110"/>
+              <w:left w:type="dxa" w:w="0"/>
+              <w:bottom w:type="dxa" w:w="110"/>
               <w:right w:type="dxa" w:w="120"/>
             </w:tcMar>
           </w:tcPr>
@@ -1774,9 +1487,9 @@
               <w:right w:val="none" w:color="FFFFFF" w:sz="0"/>
             </w:tcBorders>
             <w:tcMar>
-              <w:top w:type="dxa" w:w="90"/>
-              <w:left w:type="dxa" w:w="0"/>
-              <w:bottom w:type="dxa" w:w="90"/>
+              <w:top w:type="dxa" w:w="110"/>
+              <w:left w:type="dxa" w:w="0"/>
+              <w:bottom w:type="dxa" w:w="110"/>
               <w:right w:type="dxa" w:w="120"/>
             </w:tcMar>
           </w:tcPr>
@@ -1801,9 +1514,9 @@
               <w:right w:val="none" w:color="FFFFFF" w:sz="0"/>
             </w:tcBorders>
             <w:tcMar>
-              <w:top w:type="dxa" w:w="90"/>
-              <w:left w:type="dxa" w:w="0"/>
-              <w:bottom w:type="dxa" w:w="90"/>
+              <w:top w:type="dxa" w:w="110"/>
+              <w:left w:type="dxa" w:w="0"/>
+              <w:bottom w:type="dxa" w:w="110"/>
               <w:right w:type="dxa" w:w="120"/>
             </w:tcMar>
           </w:tcPr>
@@ -1818,7 +1531,7 @@
                 <w:sz w:val="18"/>
                 <w:szCs w:val="18"/>
               </w:rPr>
-              <w:t xml:space="preserve">Semester you’d start FAST</w:t>
+              <w:t xml:space="preserve">Semester you’d begin FAST coursework</w:t>
             </w:r>
           </w:p>
         </w:tc>
@@ -1832,9 +1545,9 @@
               <w:right w:val="none" w:color="FFFFFF" w:sz="0"/>
             </w:tcBorders>
             <w:tcMar>
-              <w:top w:type="dxa" w:w="90"/>
-              <w:left w:type="dxa" w:w="0"/>
-              <w:bottom w:type="dxa" w:w="90"/>
+              <w:top w:type="dxa" w:w="110"/>
+              <w:left w:type="dxa" w:w="0"/>
+              <w:bottom w:type="dxa" w:w="110"/>
               <w:right w:type="dxa" w:w="120"/>
             </w:tcMar>
           </w:tcPr>
@@ -1859,299 +1572,9 @@
               <w:right w:val="none" w:color="FFFFFF" w:sz="0"/>
             </w:tcBorders>
             <w:tcMar>
-              <w:top w:type="dxa" w:w="90"/>
-              <w:left w:type="dxa" w:w="0"/>
-              <w:bottom w:type="dxa" w:w="90"/>
-              <w:right w:type="dxa" w:w="120"/>
-            </w:tcMar>
-          </w:tcPr>
-          <w:p>
-            <w:pPr>
-              <w:jc w:val="left"/>
-            </w:pPr>
-            <w:r>
-              <w:rPr>
-                <w:rFonts w:ascii="Montserrat" w:cs="Montserrat" w:eastAsia="Montserrat" w:hAnsi="Montserrat"/>
-                <w:color w:val="55575B"/>
-                <w:sz w:val="18"/>
-                <w:szCs w:val="18"/>
-              </w:rPr>
-              <w:t xml:space="preserve">Units completed</w:t>
-            </w:r>
-          </w:p>
-        </w:tc>
-        <w:tc>
-          <w:tcPr>
-            <w:tcW w:type="dxa" w:w="5760"/>
-            <w:tcBorders>
-              <w:top w:val="none" w:color="FFFFFF" w:sz="0"/>
-              <w:left w:val="none" w:color="FFFFFF" w:sz="0"/>
-              <w:bottom w:val="single" w:color="E4E4E6" w:sz="4"/>
-              <w:right w:val="none" w:color="FFFFFF" w:sz="0"/>
-            </w:tcBorders>
-            <w:tcMar>
-              <w:top w:type="dxa" w:w="90"/>
-              <w:left w:type="dxa" w:w="0"/>
-              <w:bottom w:type="dxa" w:w="90"/>
-              <w:right w:type="dxa" w:w="120"/>
-            </w:tcMar>
-          </w:tcPr>
-          <w:p>
-            <w:pPr>
-              <w:jc w:val="left"/>
-            </w:pPr>
-          </w:p>
-        </w:tc>
-      </w:tr>
-      <w:tr>
-        <w:trPr>
-          <w:cantSplit/>
-        </w:trPr>
-        <w:tc>
-          <w:tcPr>
-            <w:tcW w:type="dxa" w:w="3600"/>
-            <w:tcBorders>
-              <w:top w:val="none" w:color="FFFFFF" w:sz="0"/>
-              <w:left w:val="none" w:color="FFFFFF" w:sz="0"/>
-              <w:bottom w:val="single" w:color="E4E4E6" w:sz="4"/>
-              <w:right w:val="none" w:color="FFFFFF" w:sz="0"/>
-            </w:tcBorders>
-            <w:tcMar>
-              <w:top w:type="dxa" w:w="90"/>
-              <w:left w:type="dxa" w:w="0"/>
-              <w:bottom w:type="dxa" w:w="90"/>
-              <w:right w:type="dxa" w:w="120"/>
-            </w:tcMar>
-          </w:tcPr>
-          <w:p>
-            <w:pPr>
-              <w:jc w:val="left"/>
-            </w:pPr>
-            <w:r>
-              <w:rPr>
-                <w:rFonts w:ascii="Montserrat" w:cs="Montserrat" w:eastAsia="Montserrat" w:hAnsi="Montserrat"/>
-                <w:color w:val="55575B"/>
-                <w:sz w:val="18"/>
-                <w:szCs w:val="18"/>
-              </w:rPr>
-              <w:t xml:space="preserve">Cumulative GPA</w:t>
-            </w:r>
-          </w:p>
-        </w:tc>
-        <w:tc>
-          <w:tcPr>
-            <w:tcW w:type="dxa" w:w="5760"/>
-            <w:tcBorders>
-              <w:top w:val="none" w:color="FFFFFF" w:sz="0"/>
-              <w:left w:val="none" w:color="FFFFFF" w:sz="0"/>
-              <w:bottom w:val="single" w:color="E4E4E6" w:sz="4"/>
-              <w:right w:val="none" w:color="FFFFFF" w:sz="0"/>
-            </w:tcBorders>
-            <w:tcMar>
-              <w:top w:type="dxa" w:w="90"/>
-              <w:left w:type="dxa" w:w="0"/>
-              <w:bottom w:type="dxa" w:w="90"/>
-              <w:right w:type="dxa" w:w="120"/>
-            </w:tcMar>
-          </w:tcPr>
-          <w:p>
-            <w:pPr>
-              <w:jc w:val="left"/>
-            </w:pPr>
-          </w:p>
-        </w:tc>
-      </w:tr>
-      <w:tr>
-        <w:trPr>
-          <w:cantSplit/>
-        </w:trPr>
-        <w:tc>
-          <w:tcPr>
-            <w:tcW w:type="dxa" w:w="3600"/>
-            <w:tcBorders>
-              <w:top w:val="none" w:color="FFFFFF" w:sz="0"/>
-              <w:left w:val="none" w:color="FFFFFF" w:sz="0"/>
-              <w:bottom w:val="single" w:color="E4E4E6" w:sz="4"/>
-              <w:right w:val="none" w:color="FFFFFF" w:sz="0"/>
-            </w:tcBorders>
-            <w:tcMar>
-              <w:top w:type="dxa" w:w="90"/>
-              <w:left w:type="dxa" w:w="0"/>
-              <w:bottom w:type="dxa" w:w="90"/>
-              <w:right w:type="dxa" w:w="120"/>
-            </w:tcMar>
-          </w:tcPr>
-          <w:p>
-            <w:pPr>
-              <w:jc w:val="left"/>
-            </w:pPr>
-            <w:r>
-              <w:rPr>
-                <w:rFonts w:ascii="Montserrat" w:cs="Montserrat" w:eastAsia="Montserrat" w:hAnsi="Montserrat"/>
-                <w:color w:val="55575B"/>
-                <w:sz w:val="18"/>
-                <w:szCs w:val="18"/>
-              </w:rPr>
-              <w:t xml:space="preserve">GPA in music courses</w:t>
-            </w:r>
-          </w:p>
-        </w:tc>
-        <w:tc>
-          <w:tcPr>
-            <w:tcW w:type="dxa" w:w="5760"/>
-            <w:tcBorders>
-              <w:top w:val="none" w:color="FFFFFF" w:sz="0"/>
-              <w:left w:val="none" w:color="FFFFFF" w:sz="0"/>
-              <w:bottom w:val="single" w:color="E4E4E6" w:sz="4"/>
-              <w:right w:val="none" w:color="FFFFFF" w:sz="0"/>
-            </w:tcBorders>
-            <w:tcMar>
-              <w:top w:type="dxa" w:w="90"/>
-              <w:left w:type="dxa" w:w="0"/>
-              <w:bottom w:type="dxa" w:w="90"/>
-              <w:right w:type="dxa" w:w="120"/>
-            </w:tcMar>
-          </w:tcPr>
-          <w:p>
-            <w:pPr>
-              <w:jc w:val="left"/>
-            </w:pPr>
-          </w:p>
-        </w:tc>
-      </w:tr>
-      <w:tr>
-        <w:trPr>
-          <w:cantSplit/>
-        </w:trPr>
-        <w:tc>
-          <w:tcPr>
-            <w:tcW w:type="dxa" w:w="3600"/>
-            <w:tcBorders>
-              <w:top w:val="none" w:color="FFFFFF" w:sz="0"/>
-              <w:left w:val="none" w:color="FFFFFF" w:sz="0"/>
-              <w:bottom w:val="single" w:color="E4E4E6" w:sz="4"/>
-              <w:right w:val="none" w:color="FFFFFF" w:sz="0"/>
-            </w:tcBorders>
-            <w:tcMar>
-              <w:top w:type="dxa" w:w="90"/>
-              <w:left w:type="dxa" w:w="0"/>
-              <w:bottom w:type="dxa" w:w="90"/>
-              <w:right w:type="dxa" w:w="120"/>
-            </w:tcMar>
-          </w:tcPr>
-          <w:p>
-            <w:pPr>
-              <w:jc w:val="left"/>
-            </w:pPr>
-            <w:r>
-              <w:rPr>
-                <w:rFonts w:ascii="Montserrat" w:cs="Montserrat" w:eastAsia="Montserrat" w:hAnsi="Montserrat"/>
-                <w:color w:val="55575B"/>
-                <w:sz w:val="18"/>
-                <w:szCs w:val="18"/>
-              </w:rPr>
-              <w:t xml:space="preserve">Lower-division general education complete (yes or no)</w:t>
-            </w:r>
-          </w:p>
-        </w:tc>
-        <w:tc>
-          <w:tcPr>
-            <w:tcW w:type="dxa" w:w="5760"/>
-            <w:tcBorders>
-              <w:top w:val="none" w:color="FFFFFF" w:sz="0"/>
-              <w:left w:val="none" w:color="FFFFFF" w:sz="0"/>
-              <w:bottom w:val="single" w:color="E4E4E6" w:sz="4"/>
-              <w:right w:val="none" w:color="FFFFFF" w:sz="0"/>
-            </w:tcBorders>
-            <w:tcMar>
-              <w:top w:type="dxa" w:w="90"/>
-              <w:left w:type="dxa" w:w="0"/>
-              <w:bottom w:type="dxa" w:w="90"/>
-              <w:right w:type="dxa" w:w="120"/>
-            </w:tcMar>
-          </w:tcPr>
-          <w:p>
-            <w:pPr>
-              <w:jc w:val="left"/>
-            </w:pPr>
-          </w:p>
-        </w:tc>
-      </w:tr>
-      <w:tr>
-        <w:trPr>
-          <w:cantSplit/>
-        </w:trPr>
-        <w:tc>
-          <w:tcPr>
-            <w:tcW w:type="dxa" w:w="3600"/>
-            <w:tcBorders>
-              <w:top w:val="none" w:color="FFFFFF" w:sz="0"/>
-              <w:left w:val="none" w:color="FFFFFF" w:sz="0"/>
-              <w:bottom w:val="single" w:color="E4E4E6" w:sz="4"/>
-              <w:right w:val="none" w:color="FFFFFF" w:sz="0"/>
-            </w:tcBorders>
-            <w:tcMar>
-              <w:top w:type="dxa" w:w="90"/>
-              <w:left w:type="dxa" w:w="0"/>
-              <w:bottom w:type="dxa" w:w="90"/>
-              <w:right w:type="dxa" w:w="120"/>
-            </w:tcMar>
-          </w:tcPr>
-          <w:p>
-            <w:pPr>
-              <w:jc w:val="left"/>
-            </w:pPr>
-            <w:r>
-              <w:rPr>
-                <w:rFonts w:ascii="Montserrat" w:cs="Montserrat" w:eastAsia="Montserrat" w:hAnsi="Montserrat"/>
-                <w:color w:val="55575B"/>
-                <w:sz w:val="18"/>
-                <w:szCs w:val="18"/>
-              </w:rPr>
-              <w:t xml:space="preserve">Lower-division core music courses complete (yes or no)</w:t>
-            </w:r>
-          </w:p>
-        </w:tc>
-        <w:tc>
-          <w:tcPr>
-            <w:tcW w:type="dxa" w:w="5760"/>
-            <w:tcBorders>
-              <w:top w:val="none" w:color="FFFFFF" w:sz="0"/>
-              <w:left w:val="none" w:color="FFFFFF" w:sz="0"/>
-              <w:bottom w:val="single" w:color="E4E4E6" w:sz="4"/>
-              <w:right w:val="none" w:color="FFFFFF" w:sz="0"/>
-            </w:tcBorders>
-            <w:tcMar>
-              <w:top w:type="dxa" w:w="90"/>
-              <w:left w:type="dxa" w:w="0"/>
-              <w:bottom w:type="dxa" w:w="90"/>
-              <w:right w:type="dxa" w:w="120"/>
-            </w:tcMar>
-          </w:tcPr>
-          <w:p>
-            <w:pPr>
-              <w:jc w:val="left"/>
-            </w:pPr>
-          </w:p>
-        </w:tc>
-      </w:tr>
-      <w:tr>
-        <w:trPr>
-          <w:cantSplit/>
-        </w:trPr>
-        <w:tc>
-          <w:tcPr>
-            <w:tcW w:type="dxa" w:w="3600"/>
-            <w:tcBorders>
-              <w:top w:val="none" w:color="FFFFFF" w:sz="0"/>
-              <w:left w:val="none" w:color="FFFFFF" w:sz="0"/>
-              <w:bottom w:val="single" w:color="E4E4E6" w:sz="4"/>
-              <w:right w:val="none" w:color="FFFFFF" w:sz="0"/>
-            </w:tcBorders>
-            <w:tcMar>
-              <w:top w:type="dxa" w:w="90"/>
-              <w:left w:type="dxa" w:w="0"/>
-              <w:bottom w:type="dxa" w:w="90"/>
+              <w:top w:type="dxa" w:w="110"/>
+              <w:left w:type="dxa" w:w="0"/>
+              <w:bottom w:type="dxa" w:w="110"/>
               <w:right w:type="dxa" w:w="120"/>
             </w:tcMar>
           </w:tcPr>
@@ -2180,9 +1603,9 @@
               <w:right w:val="none" w:color="FFFFFF" w:sz="0"/>
             </w:tcBorders>
             <w:tcMar>
-              <w:top w:type="dxa" w:w="90"/>
-              <w:left w:type="dxa" w:w="0"/>
-              <w:bottom w:type="dxa" w:w="90"/>
+              <w:top w:type="dxa" w:w="110"/>
+              <w:left w:type="dxa" w:w="0"/>
+              <w:bottom w:type="dxa" w:w="110"/>
               <w:right w:type="dxa" w:w="120"/>
             </w:tcMar>
           </w:tcPr>
@@ -2207,9 +1630,9 @@
               <w:right w:val="none" w:color="FFFFFF" w:sz="0"/>
             </w:tcBorders>
             <w:tcMar>
-              <w:top w:type="dxa" w:w="90"/>
-              <w:left w:type="dxa" w:w="0"/>
-              <w:bottom w:type="dxa" w:w="90"/>
+              <w:top w:type="dxa" w:w="110"/>
+              <w:left w:type="dxa" w:w="0"/>
+              <w:bottom w:type="dxa" w:w="110"/>
               <w:right w:type="dxa" w:w="120"/>
             </w:tcMar>
           </w:tcPr>
@@ -2224,7 +1647,7 @@
                 <w:sz w:val="18"/>
                 <w:szCs w:val="18"/>
               </w:rPr>
-              <w:t xml:space="preserve">Recommender 1</w:t>
+              <w:t xml:space="preserve">Recommender 1 (name and email)</w:t>
             </w:r>
           </w:p>
         </w:tc>
@@ -2238,9 +1661,9 @@
               <w:right w:val="none" w:color="FFFFFF" w:sz="0"/>
             </w:tcBorders>
             <w:tcMar>
-              <w:top w:type="dxa" w:w="90"/>
-              <w:left w:type="dxa" w:w="0"/>
-              <w:bottom w:type="dxa" w:w="90"/>
+              <w:top w:type="dxa" w:w="110"/>
+              <w:left w:type="dxa" w:w="0"/>
+              <w:bottom w:type="dxa" w:w="110"/>
               <w:right w:type="dxa" w:w="120"/>
             </w:tcMar>
           </w:tcPr>
@@ -2265,9 +1688,9 @@
               <w:right w:val="none" w:color="FFFFFF" w:sz="0"/>
             </w:tcBorders>
             <w:tcMar>
-              <w:top w:type="dxa" w:w="90"/>
-              <w:left w:type="dxa" w:w="0"/>
-              <w:bottom w:type="dxa" w:w="90"/>
+              <w:top w:type="dxa" w:w="110"/>
+              <w:left w:type="dxa" w:w="0"/>
+              <w:bottom w:type="dxa" w:w="110"/>
               <w:right w:type="dxa" w:w="120"/>
             </w:tcMar>
           </w:tcPr>
@@ -2282,7 +1705,7 @@
                 <w:sz w:val="18"/>
                 <w:szCs w:val="18"/>
               </w:rPr>
-              <w:t xml:space="preserve">Recommender 2</w:t>
+              <w:t xml:space="preserve">Recommender 2 (name and email)</w:t>
             </w:r>
           </w:p>
         </w:tc>
@@ -2296,9 +1719,9 @@
               <w:right w:val="none" w:color="FFFFFF" w:sz="0"/>
             </w:tcBorders>
             <w:tcMar>
-              <w:top w:type="dxa" w:w="90"/>
-              <w:left w:type="dxa" w:w="0"/>
-              <w:bottom w:type="dxa" w:w="90"/>
+              <w:top w:type="dxa" w:w="110"/>
+              <w:left w:type="dxa" w:w="0"/>
+              <w:bottom w:type="dxa" w:w="110"/>
               <w:right w:type="dxa" w:w="120"/>
             </w:tcMar>
           </w:tcPr>
@@ -2323,9 +1746,9 @@
               <w:right w:val="none" w:color="FFFFFF" w:sz="0"/>
             </w:tcBorders>
             <w:tcMar>
-              <w:top w:type="dxa" w:w="90"/>
-              <w:left w:type="dxa" w:w="0"/>
-              <w:bottom w:type="dxa" w:w="90"/>
+              <w:top w:type="dxa" w:w="110"/>
+              <w:left w:type="dxa" w:w="0"/>
+              <w:bottom w:type="dxa" w:w="110"/>
               <w:right w:type="dxa" w:w="120"/>
             </w:tcMar>
           </w:tcPr>
@@ -2340,7 +1763,7 @@
                 <w:sz w:val="18"/>
                 <w:szCs w:val="18"/>
               </w:rPr>
-              <w:t xml:space="preserve">Links to recordings, video, or scores</w:t>
+              <w:t xml:space="preserve">Links to evidence of abilities</w:t>
             </w:r>
           </w:p>
         </w:tc>
@@ -2354,67 +1777,9 @@
               <w:right w:val="none" w:color="FFFFFF" w:sz="0"/>
             </w:tcBorders>
             <w:tcMar>
-              <w:top w:type="dxa" w:w="90"/>
-              <w:left w:type="dxa" w:w="0"/>
-              <w:bottom w:type="dxa" w:w="90"/>
-              <w:right w:type="dxa" w:w="120"/>
-            </w:tcMar>
-          </w:tcPr>
-          <w:p>
-            <w:pPr>
-              <w:jc w:val="left"/>
-            </w:pPr>
-          </w:p>
-        </w:tc>
-      </w:tr>
-      <w:tr>
-        <w:trPr>
-          <w:cantSplit/>
-        </w:trPr>
-        <w:tc>
-          <w:tcPr>
-            <w:tcW w:type="dxa" w:w="3600"/>
-            <w:tcBorders>
-              <w:top w:val="none" w:color="FFFFFF" w:sz="0"/>
-              <w:left w:val="none" w:color="FFFFFF" w:sz="0"/>
-              <w:bottom w:val="single" w:color="E4E4E6" w:sz="4"/>
-              <w:right w:val="none" w:color="FFFFFF" w:sz="0"/>
-            </w:tcBorders>
-            <w:tcMar>
-              <w:top w:type="dxa" w:w="90"/>
-              <w:left w:type="dxa" w:w="0"/>
-              <w:bottom w:type="dxa" w:w="90"/>
-              <w:right w:type="dxa" w:w="120"/>
-            </w:tcMar>
-          </w:tcPr>
-          <w:p>
-            <w:pPr>
-              <w:jc w:val="left"/>
-            </w:pPr>
-            <w:r>
-              <w:rPr>
-                <w:rFonts w:ascii="Montserrat" w:cs="Montserrat" w:eastAsia="Montserrat" w:hAnsi="Montserrat"/>
-                <w:color w:val="55575B"/>
-                <w:sz w:val="18"/>
-                <w:szCs w:val="18"/>
-              </w:rPr>
-              <w:t xml:space="preserve">Live audition requested (Performance, yes or no)</w:t>
-            </w:r>
-          </w:p>
-        </w:tc>
-        <w:tc>
-          <w:tcPr>
-            <w:tcW w:type="dxa" w:w="5760"/>
-            <w:tcBorders>
-              <w:top w:val="none" w:color="FFFFFF" w:sz="0"/>
-              <w:left w:val="none" w:color="FFFFFF" w:sz="0"/>
-              <w:bottom w:val="single" w:color="E4E4E6" w:sz="4"/>
-              <w:right w:val="none" w:color="FFFFFF" w:sz="0"/>
-            </w:tcBorders>
-            <w:tcMar>
-              <w:top w:type="dxa" w:w="90"/>
-              <w:left w:type="dxa" w:w="0"/>
-              <w:bottom w:type="dxa" w:w="90"/>
+              <w:top w:type="dxa" w:w="110"/>
+              <w:left w:type="dxa" w:w="0"/>
+              <w:bottom w:type="dxa" w:w="110"/>
               <w:right w:type="dxa" w:w="120"/>
             </w:tcMar>
           </w:tcPr>

</xml_diff>

<commit_message>
FAST: eligibility and admission rules from the university handbook
Undergraduate handbook, section 08:
- Definition of program-applicable units.
- F-1 students: contact CIE before applying; new I-20 and 12-to-8 unit
  minimum at graduate status; CPT and OPT availability.
- Eligibility requirements apply without exception.
- Substitutions and exceptions approved before admission are re-entered
  by the Graduate Coordinator in the first FAST semester.

FAST application form: F-1 checkbox added to the eligibility checklist.
</commit_message>
<xml_diff>
--- a/documents/forms/fast-application.docx
+++ b/documents/forms/fast-application.docx
@@ -598,6 +598,49 @@
           <w:szCs w:val="22"/>
         </w:rPr>
         <w:t xml:space="preserve">My cumulative GPA is at least 3.0.</w:t>
+      </w:r>
+    </w:p>
+    <w:p>
+      <w:pPr>
+        <w:tabs>
+          <w:tab w:val="left" w:pos="400"/>
+        </w:tabs>
+        <w:spacing w:after="90" w:line="320"/>
+        <w:ind w:left="400" w:hanging="400"/>
+      </w:pPr>
+      <w:sdt>
+        <w:sdtPr>
+          <w:rPr>
+            <w:rFonts w:ascii="MS Gothic" w:eastAsia="MS Gothic" w:hAnsi="MS Gothic"/>
+            <w:sz w:val="22"/>
+          </w:rPr>
+          <w14:checkbox>
+            <w14:checked w14:val="0"/>
+            <w14:checkedState w14:val="2612" w14:font="MS Gothic"/>
+            <w14:uncheckedState w14:val="2610" w14:font="MS Gothic"/>
+          </w14:checkbox>
+        </w:sdtPr>
+        <w:sdtContent>
+          <w:r>
+            <w:rPr>
+              <w:rFonts w:ascii="MS Gothic" w:eastAsia="MS Gothic" w:hAnsi="MS Gothic"/>
+              <w:sz w:val="22"/>
+            </w:rPr>
+            <w:t>☐</w:t>
+          </w:r>
+        </w:sdtContent>
+      </w:sdt>
+      <w:r>
+        <w:tab/>
+      </w:r>
+      <w:r>
+        <w:rPr>
+          <w:rFonts w:ascii="Roboto Serif" w:cs="Roboto Serif" w:eastAsia="Roboto Serif" w:hAnsi="Roboto Serif"/>
+          <w:color w:val="000000"/>
+          <w:sz w:val="22"/>
+          <w:szCs w:val="22"/>
+        </w:rPr>
+        <w:t xml:space="preserve">If I’m on an F-1 visa, I’ve contacted the Center for International Education.</w:t>
       </w:r>
     </w:p>
     <w:p>

</xml_diff>

<commit_message>
FAST application form: current status and form name
Record header status set to Current; Document field and footer read
FAST application form.
</commit_message>
<xml_diff>
--- a/documents/forms/fast-application.docx
+++ b/documents/forms/fast-application.docx
@@ -117,7 +117,7 @@
                 <w:sz w:val="20"/>
                 <w:szCs w:val="20"/>
               </w:rPr>
-              <w:t xml:space="preserve">FAST application</w:t>
+              <w:t xml:space="preserve">FAST application form</w:t>
             </w:r>
           </w:p>
         </w:tc>
@@ -206,7 +206,7 @@
                 <w:sz w:val="20"/>
                 <w:szCs w:val="20"/>
               </w:rPr>
-              <w:t xml:space="preserve">Draft for review</w:t>
+              <w:t xml:space="preserve">Current</w:t>
             </w:r>
           </w:p>
         </w:tc>
@@ -2008,7 +2008,7 @@
         <w:sz w:val="18"/>
         <w:szCs w:val="18"/>
       </w:rPr>
-      <w:t xml:space="preserve">FAST application · Department of Music and Performing Arts</w:t>
+      <w:t xml:space="preserve">FAST application form · Department of Music and Performing Arts</w:t>
     </w:r>
     <w:r>
       <w:tab/>

</xml_diff>

<commit_message>
FAST eligibility: double majors aren't eligible
Undergraduate handbook section 08 and FAST infosheet: a new eligibility
item, music as the only major.
FAST application form: a checklist item for music as the only major.
B.A. and M.A. infosheets, admissions emails, README, grad facilitator
status: the exclusion sits with the second-bachelor's exclusion.
PDFs re-rendered; email templates and preview page rebuilt.

Co-Authored-By: Claude Opus 5.5 <noreply@anthropic.com>
Claude-Session: https://claude.ai/code/session_01PgutPfG2Vpv5m8xJK9RNXv
</commit_message>
<xml_diff>
--- a/documents/forms/fast-application.docx
+++ b/documents/forms/fast-application.docx
@@ -469,6 +469,49 @@
           <w:szCs w:val="22"/>
         </w:rPr>
         <w:t xml:space="preserve">I’m enrolled in the B.A. in Music at CSU East Bay as my first bachelor’s degree.</w:t>
+      </w:r>
+    </w:p>
+    <w:p>
+      <w:pPr>
+        <w:tabs>
+          <w:tab w:val="left" w:pos="400"/>
+        </w:tabs>
+        <w:spacing w:after="90" w:line="320"/>
+        <w:ind w:left="400" w:hanging="400"/>
+      </w:pPr>
+      <w:sdt>
+        <w:sdtPr>
+          <w:rPr>
+            <w:rFonts w:ascii="MS Gothic" w:eastAsia="MS Gothic" w:hAnsi="MS Gothic"/>
+            <w:sz w:val="22"/>
+          </w:rPr>
+          <w14:checkbox>
+            <w14:checked w14:val="0"/>
+            <w14:checkedState w14:val="2612" w14:font="MS Gothic"/>
+            <w14:uncheckedState w14:val="2610" w14:font="MS Gothic"/>
+          </w14:checkbox>
+        </w:sdtPr>
+        <w:sdtContent>
+          <w:r>
+            <w:rPr>
+              <w:rFonts w:ascii="MS Gothic" w:eastAsia="MS Gothic" w:hAnsi="MS Gothic"/>
+              <w:sz w:val="22"/>
+            </w:rPr>
+            <w:t>☐</w:t>
+          </w:r>
+        </w:sdtContent>
+      </w:sdt>
+      <w:r>
+        <w:tab/>
+      </w:r>
+      <w:r>
+        <w:rPr>
+          <w:rFonts w:ascii="Roboto Serif" w:cs="Roboto Serif" w:eastAsia="Roboto Serif" w:hAnsi="Roboto Serif"/>
+          <w:color w:val="000000"/>
+          <w:sz w:val="22"/>
+          <w:szCs w:val="22"/>
+        </w:rPr>
+        <w:t xml:space="preserve">Music is my only major.</w:t>
       </w:r>
     </w:p>
     <w:p>

</xml_diff>